<commit_message>
Json And Firebase Assignment
Json And Firebase Assignment
</commit_message>
<xml_diff>
--- a/Json and firebase (Theory)/Json Server Theory.docx
+++ b/Json and firebase (Theory)/Json Server Theory.docx
@@ -16,23 +16,7 @@
           <w:b/>
           <w:bCs/>
         </w:rPr>
-        <w:t xml:space="preserve">Q-1 </w:t>
-      </w:r>
-      <w:r>
-        <w:rPr>
-          <w:rFonts w:hint="default" w:ascii="Arial" w:hAnsi="Arial" w:cs="Arial"/>
-          <w:b/>
-          <w:bCs/>
-        </w:rPr>
-        <w:t xml:space="preserve"> </w:t>
-      </w:r>
-      <w:r>
-        <w:rPr>
-          <w:rFonts w:hint="default" w:ascii="Arial" w:hAnsi="Arial" w:cs="Arial"/>
-          <w:b/>
-          <w:bCs/>
-        </w:rPr>
-        <w:t>What do you mean by RESTful web services?</w:t>
+        <w:t>Q-1  What do you mean by RESTful web services?</w:t>
       </w:r>
     </w:p>
     <w:p>
@@ -165,364 +149,9 @@
       </w:pPr>
       <w:r>
         <w:rPr>
-          <w:rFonts w:hint="default" w:ascii="Arial" w:hAnsi="Arial" w:cs="Arial"/>
-        </w:rPr>
-        <w:t xml:space="preserve">1. Send HTTP Request: Use fetch API or Axios to send a GET request to the </w:t>
-      </w:r>
-      <w:r>
-        <w:rPr>
-          <w:rFonts w:hint="default" w:ascii="Arial" w:hAnsi="Arial" w:cs="Arial"/>
-          <w:lang w:val="en-US"/>
-        </w:rPr>
-        <w:t>JONSON-server</w:t>
-      </w:r>
-      <w:r>
-        <w:rPr>
-          <w:rFonts w:hint="default" w:ascii="Arial" w:hAnsi="Arial" w:cs="Arial"/>
-        </w:rPr>
-        <w:t xml:space="preserve"> API.</w:t>
-      </w:r>
-    </w:p>
-    <w:p>
-      <w:pPr>
-        <w:rPr>
-          <w:rFonts w:hint="default" w:ascii="Arial" w:hAnsi="Arial" w:cs="Arial"/>
-        </w:rPr>
-      </w:pPr>
-      <w:r>
-        <w:rPr>
-          <w:rFonts w:hint="default" w:ascii="Arial" w:hAnsi="Arial" w:cs="Arial"/>
-        </w:rPr>
-        <w:t>2. Get Response: Receive the response data from the API.</w:t>
-      </w:r>
-    </w:p>
-    <w:p>
-      <w:pPr>
-        <w:rPr>
-          <w:rFonts w:hint="default" w:ascii="Arial" w:hAnsi="Arial" w:cs="Arial"/>
-        </w:rPr>
-      </w:pPr>
-      <w:r>
-        <w:rPr>
-          <w:rFonts w:hint="default" w:ascii="Arial" w:hAnsi="Arial" w:cs="Arial"/>
-        </w:rPr>
-        <w:t>3. Parse JSON: Convert the response data from JSON to JavaScript objects.</w:t>
-      </w:r>
-    </w:p>
-    <w:p>
-      <w:pPr>
-        <w:rPr>
-          <w:rFonts w:hint="default" w:ascii="Arial" w:hAnsi="Arial" w:cs="Arial"/>
-        </w:rPr>
-      </w:pPr>
-      <w:r>
-        <w:rPr>
-          <w:rFonts w:hint="default" w:ascii="Arial" w:hAnsi="Arial" w:cs="Arial"/>
-        </w:rPr>
-        <w:t>4. Update State: Use React Hooks (e.g., use State, use Effect) to update the component's state with the received data.</w:t>
-      </w:r>
-    </w:p>
-    <w:p>
-      <w:pPr>
-        <w:rPr>
-          <w:rFonts w:hint="default" w:ascii="Arial" w:hAnsi="Arial" w:cs="Arial"/>
-        </w:rPr>
-      </w:pPr>
-      <w:r>
-        <w:rPr>
-          <w:rFonts w:hint="default" w:ascii="Arial" w:hAnsi="Arial" w:cs="Arial"/>
-        </w:rPr>
-        <w:t>5. Render Data: Use JSX to render the received data in the component.</w:t>
-      </w:r>
-    </w:p>
-    <w:p>
-      <w:pPr>
-        <w:rPr>
-          <w:rFonts w:hint="default" w:ascii="Arial" w:hAnsi="Arial" w:cs="Arial"/>
-          <w:b/>
-          <w:bCs/>
-        </w:rPr>
-      </w:pPr>
-      <w:r>
-        <w:rPr>
-          <w:rFonts w:hint="default" w:ascii="Arial" w:hAnsi="Arial" w:cs="Arial"/>
-          <w:b/>
-          <w:bCs/>
-        </w:rPr>
-        <w:t>Fetch()</w:t>
-      </w:r>
-    </w:p>
-    <w:p>
-      <w:pPr>
-        <w:rPr>
-          <w:rFonts w:hint="default" w:ascii="Arial" w:hAnsi="Arial" w:cs="Arial"/>
-        </w:rPr>
-      </w:pPr>
-      <w:r>
-        <w:rPr>
-          <w:rFonts w:hint="default" w:ascii="Arial" w:hAnsi="Arial" w:cs="Arial"/>
-        </w:rPr>
-        <w:t>1. Sends HTTP requests: fetch() sends HTTP requests to a server, allowing you to interact with APIs.</w:t>
-      </w:r>
-    </w:p>
-    <w:p>
-      <w:pPr>
-        <w:rPr>
-          <w:rFonts w:hint="default" w:ascii="Arial" w:hAnsi="Arial" w:cs="Arial"/>
-        </w:rPr>
-      </w:pPr>
-      <w:r>
-        <w:rPr>
-          <w:rFonts w:hint="default" w:ascii="Arial" w:hAnsi="Arial" w:cs="Arial"/>
-        </w:rPr>
-        <w:t>2. Returns a Promise: fetch() returns a Promise that resolves to the response data.</w:t>
-      </w:r>
-    </w:p>
-    <w:p>
-      <w:pPr>
-        <w:rPr>
-          <w:rFonts w:hint="default" w:ascii="Arial" w:hAnsi="Arial" w:cs="Arial"/>
-        </w:rPr>
-      </w:pPr>
-      <w:r>
-        <w:rPr>
-          <w:rFonts w:hint="default" w:ascii="Arial" w:hAnsi="Arial" w:cs="Arial"/>
-        </w:rPr>
-        <w:t>3. Supports various HTTP methods: fetch() supports GET, POST, PUT, DELETE, and other HTTP methods.</w:t>
-      </w:r>
-    </w:p>
-    <w:p>
-      <w:pPr>
-        <w:rPr>
-          <w:rFonts w:hint="default" w:ascii="Arial" w:hAnsi="Arial" w:cs="Arial"/>
-        </w:rPr>
-      </w:pPr>
-      <w:r>
-        <w:rPr>
-          <w:rFonts w:hint="default" w:ascii="Arial" w:hAnsi="Arial" w:cs="Arial"/>
-        </w:rPr>
-        <w:t>4. Handles response data: fetch() provides methods to handle response data, such as json(), text(), and blob().</w:t>
-      </w:r>
-    </w:p>
-    <w:p>
-      <w:pPr>
-        <w:rPr>
-          <w:rFonts w:hint="default" w:ascii="Arial" w:hAnsi="Arial" w:cs="Arial"/>
-        </w:rPr>
-      </w:pPr>
-    </w:p>
-    <w:p>
-      <w:pPr>
-        <w:rPr>
-          <w:rFonts w:hint="default" w:ascii="Arial" w:hAnsi="Arial" w:cs="Arial"/>
-          <w:b/>
-          <w:bCs/>
-        </w:rPr>
-      </w:pPr>
-      <w:r>
-        <w:rPr>
-          <w:rFonts w:hint="default" w:ascii="Arial" w:hAnsi="Arial" w:cs="Arial"/>
-          <w:b/>
-          <w:bCs/>
-        </w:rPr>
-        <w:t>Axios()</w:t>
-      </w:r>
-    </w:p>
-    <w:p>
-      <w:pPr>
-        <w:rPr>
-          <w:rFonts w:hint="default" w:ascii="Arial" w:hAnsi="Arial" w:cs="Arial"/>
-        </w:rPr>
-      </w:pPr>
-      <w:r>
-        <w:rPr>
-          <w:rFonts w:hint="default" w:ascii="Arial" w:hAnsi="Arial" w:cs="Arial"/>
-        </w:rPr>
-        <w:t>1. Sends HTTP requests: axios() sends HTTP requests to a server, allowing you to interact with APIs.</w:t>
-      </w:r>
-    </w:p>
-    <w:p>
-      <w:pPr>
-        <w:rPr>
-          <w:rFonts w:hint="default" w:ascii="Arial" w:hAnsi="Arial" w:cs="Arial"/>
-        </w:rPr>
-      </w:pPr>
-      <w:r>
-        <w:rPr>
-          <w:rFonts w:hint="default" w:ascii="Arial" w:hAnsi="Arial" w:cs="Arial"/>
-        </w:rPr>
-        <w:t>2. Returns a Promise: axios() returns a Promise that resolves to the response data.</w:t>
-      </w:r>
-    </w:p>
-    <w:p>
-      <w:pPr>
-        <w:rPr>
-          <w:rFonts w:hint="default" w:ascii="Arial" w:hAnsi="Arial" w:cs="Arial"/>
-        </w:rPr>
-      </w:pPr>
-      <w:r>
-        <w:rPr>
-          <w:rFonts w:hint="default" w:ascii="Arial" w:hAnsi="Arial" w:cs="Arial"/>
-        </w:rPr>
-        <w:t>3. Supports various HTTP methods: axios() supports GET, POST, PUT, DELETE, and other HTTP methods.</w:t>
-      </w:r>
-    </w:p>
-    <w:p>
-      <w:pPr>
-        <w:rPr>
-          <w:rFonts w:hint="default" w:ascii="Arial" w:hAnsi="Arial" w:cs="Arial"/>
-        </w:rPr>
-      </w:pPr>
-      <w:r>
-        <w:rPr>
-          <w:rFonts w:hint="default" w:ascii="Arial" w:hAnsi="Arial" w:cs="Arial"/>
-        </w:rPr>
-        <w:t>4. Provides a simpler API: axios() provides a simpler API compared to fetch(), with a more intuitive syntax.</w:t>
-      </w:r>
-    </w:p>
-    <w:p>
-      <w:pPr>
-        <w:rPr>
-          <w:rFonts w:hint="default" w:ascii="Arial" w:hAnsi="Arial" w:cs="Arial"/>
-        </w:rPr>
-      </w:pPr>
-      <w:r>
-        <w:rPr>
-          <w:rFonts w:hint="default" w:ascii="Arial" w:hAnsi="Arial" w:cs="Arial"/>
-        </w:rPr>
-        <w:t>5. Handles response data: axios() automatically converts response data to JSON, making it easier to work with.</w:t>
-      </w:r>
-    </w:p>
-    <w:p>
-      <w:pPr>
-        <w:rPr>
-          <w:rFonts w:hint="default" w:ascii="Arial" w:hAnsi="Arial" w:cs="Arial"/>
-          <w:b/>
-          <w:bCs/>
-        </w:rPr>
-      </w:pPr>
-      <w:r>
-        <w:rPr>
-          <w:rFonts w:hint="default" w:ascii="Arial" w:hAnsi="Arial" w:cs="Arial"/>
-          <w:b/>
-          <w:bCs/>
-        </w:rPr>
-        <w:t>Q-4 What is Firebase? What features does Firebase offer?</w:t>
-      </w:r>
-    </w:p>
-    <w:p>
-      <w:pPr>
-        <w:rPr>
-          <w:rFonts w:hint="default" w:ascii="Arial" w:hAnsi="Arial" w:cs="Arial"/>
-        </w:rPr>
-      </w:pPr>
-      <w:r>
-        <w:rPr>
-          <w:rFonts w:hint="default" w:ascii="Arial" w:hAnsi="Arial" w:cs="Arial"/>
-          <w:b/>
-          <w:bCs/>
-        </w:rPr>
-        <w:t xml:space="preserve">Ans : </w:t>
-      </w:r>
-      <w:r>
-        <w:rPr>
-          <w:rFonts w:hint="default" w:ascii="Arial" w:hAnsi="Arial" w:cs="Arial"/>
-          <w:b/>
-          <w:bCs/>
-        </w:rPr>
-        <w:tab/>
-      </w:r>
-      <w:r>
-        <w:rPr>
-          <w:rFonts w:hint="default" w:ascii="Arial" w:hAnsi="Arial" w:cs="Arial"/>
-        </w:rPr>
-        <w:t>Firebase is a cloud-hosted platform that provides a suite of tools and services for building, managing, and scaling web and mobile applications. Firebase offers a range of features that enable developers to focus on building their applications without worrying about the underlying infrastructure.</w:t>
-      </w:r>
-    </w:p>
-    <w:p>
-      <w:pPr>
-        <w:rPr>
-          <w:rFonts w:hint="default" w:ascii="Arial" w:hAnsi="Arial" w:cs="Arial"/>
-          <w:b/>
-          <w:bCs/>
-        </w:rPr>
-      </w:pPr>
-      <w:r>
-        <w:rPr>
-          <w:rFonts w:hint="default" w:ascii="Arial" w:hAnsi="Arial" w:cs="Arial"/>
-          <w:b/>
-          <w:bCs/>
-        </w:rPr>
-        <w:t xml:space="preserve">Q-5 Discuss the importance of handling errors and loading states when working </w:t>
-      </w:r>
-    </w:p>
-    <w:p>
-      <w:pPr>
-        <w:rPr>
-          <w:rFonts w:hint="default" w:ascii="Arial" w:hAnsi="Arial" w:cs="Arial"/>
-          <w:b/>
-          <w:bCs/>
-        </w:rPr>
-      </w:pPr>
-      <w:r>
-        <w:rPr>
-          <w:rFonts w:hint="default" w:ascii="Arial" w:hAnsi="Arial" w:cs="Arial"/>
-          <w:b/>
-          <w:bCs/>
-        </w:rPr>
-        <w:t>withAPIs in React</w:t>
-      </w:r>
-    </w:p>
-    <w:p>
-      <w:pPr>
-        <w:rPr>
-          <w:rFonts w:hint="default" w:ascii="Arial" w:hAnsi="Arial" w:cs="Arial"/>
-        </w:rPr>
-      </w:pPr>
-      <w:r>
-        <w:rPr>
-          <w:rFonts w:hint="default" w:ascii="Arial" w:hAnsi="Arial" w:cs="Arial"/>
-          <w:b/>
-          <w:bCs/>
-        </w:rPr>
-        <w:t>Ans :</w:t>
-      </w:r>
-      <w:r>
-        <w:rPr>
-          <w:rFonts w:hint="default" w:ascii="Arial" w:hAnsi="Arial" w:cs="Arial"/>
-        </w:rPr>
-        <w:t xml:space="preserve"> </w:t>
-      </w:r>
-    </w:p>
-    <w:p>
-      <w:pPr>
-        <w:rPr>
-          <w:rFonts w:hint="default" w:ascii="Arial" w:hAnsi="Arial" w:cs="Arial"/>
-          <w:b/>
-          <w:bCs/>
-        </w:rPr>
-      </w:pPr>
-      <w:r>
-        <w:rPr>
-          <w:rFonts w:hint="default" w:ascii="Arial" w:hAnsi="Arial" w:cs="Arial"/>
-          <w:b/>
-          <w:bCs/>
-        </w:rPr>
-        <w:t>Importance of Error Handling</w:t>
-      </w:r>
-    </w:p>
-    <w:p>
-      <w:pPr>
-        <w:rPr>
-          <w:rFonts w:hint="default" w:ascii="Arial" w:hAnsi="Arial" w:cs="Arial"/>
-        </w:rPr>
-      </w:pPr>
-      <w:r>
-        <w:rPr>
-          <w:rFonts w:hint="default" w:ascii="Arial" w:hAnsi="Arial" w:cs="Arial"/>
-          <w:lang w:val="en-US"/>
-        </w:rPr>
-        <w:t>1.</w:t>
+          <w:rFonts w:hint="default" w:ascii="Arial" w:hAnsi="Arial"/>
+        </w:rPr>
+        <w:t>⇒</w:t>
       </w:r>
       <w:bookmarkStart w:id="0" w:name="_GoBack"/>
       <w:bookmarkEnd w:id="0"/>
@@ -530,6 +159,445 @@
         <w:rPr>
           <w:rFonts w:hint="default" w:ascii="Arial" w:hAnsi="Arial" w:cs="Arial"/>
         </w:rPr>
+        <w:t xml:space="preserve"> Send HTTP Request: Use fetch API or Axios to send a GET request to the </w:t>
+      </w:r>
+      <w:r>
+        <w:rPr>
+          <w:rFonts w:hint="default" w:ascii="Arial" w:hAnsi="Arial" w:cs="Arial"/>
+          <w:lang w:val="en-US"/>
+        </w:rPr>
+        <w:t>JONSON-server</w:t>
+      </w:r>
+      <w:r>
+        <w:rPr>
+          <w:rFonts w:hint="default" w:ascii="Arial" w:hAnsi="Arial" w:cs="Arial"/>
+        </w:rPr>
+        <w:t xml:space="preserve"> API.</w:t>
+      </w:r>
+    </w:p>
+    <w:p>
+      <w:pPr>
+        <w:rPr>
+          <w:rFonts w:hint="default" w:ascii="Arial" w:hAnsi="Arial" w:cs="Arial"/>
+        </w:rPr>
+      </w:pPr>
+      <w:r>
+        <w:rPr>
+          <w:rFonts w:hint="default" w:ascii="Arial" w:hAnsi="Arial"/>
+        </w:rPr>
+        <w:t>⇒</w:t>
+      </w:r>
+      <w:r>
+        <w:rPr>
+          <w:rFonts w:hint="default" w:ascii="Arial" w:hAnsi="Arial" w:cs="Arial"/>
+        </w:rPr>
+        <w:t xml:space="preserve"> Get Response: Receive the response data from the API.</w:t>
+      </w:r>
+    </w:p>
+    <w:p>
+      <w:pPr>
+        <w:rPr>
+          <w:rFonts w:hint="default" w:ascii="Arial" w:hAnsi="Arial" w:cs="Arial"/>
+        </w:rPr>
+      </w:pPr>
+      <w:r>
+        <w:rPr>
+          <w:rFonts w:hint="default" w:ascii="Arial" w:hAnsi="Arial"/>
+        </w:rPr>
+        <w:t>⇒</w:t>
+      </w:r>
+      <w:r>
+        <w:rPr>
+          <w:rFonts w:hint="default" w:ascii="Arial" w:hAnsi="Arial" w:cs="Arial"/>
+        </w:rPr>
+        <w:t xml:space="preserve"> Parse JSON: Convert the response data from JSON to JavaScript objects.</w:t>
+      </w:r>
+    </w:p>
+    <w:p>
+      <w:pPr>
+        <w:rPr>
+          <w:rFonts w:hint="default" w:ascii="Arial" w:hAnsi="Arial" w:cs="Arial"/>
+        </w:rPr>
+      </w:pPr>
+      <w:r>
+        <w:rPr>
+          <w:rFonts w:hint="default" w:ascii="Arial" w:hAnsi="Arial"/>
+        </w:rPr>
+        <w:t>⇒</w:t>
+      </w:r>
+      <w:r>
+        <w:rPr>
+          <w:rFonts w:hint="default" w:ascii="Arial" w:hAnsi="Arial" w:cs="Arial"/>
+        </w:rPr>
+        <w:t xml:space="preserve"> Update State: Use React Hooks (e.g., use State, use Effect) to update the component's state with the received data.</w:t>
+      </w:r>
+    </w:p>
+    <w:p>
+      <w:pPr>
+        <w:rPr>
+          <w:rFonts w:hint="default" w:ascii="Arial" w:hAnsi="Arial" w:cs="Arial"/>
+        </w:rPr>
+      </w:pPr>
+      <w:r>
+        <w:rPr>
+          <w:rFonts w:hint="default" w:ascii="Arial" w:hAnsi="Arial"/>
+        </w:rPr>
+        <w:t>⇒</w:t>
+      </w:r>
+      <w:r>
+        <w:rPr>
+          <w:rFonts w:hint="default" w:ascii="Arial" w:hAnsi="Arial" w:cs="Arial"/>
+        </w:rPr>
+        <w:t xml:space="preserve"> Render Data: Use JSX to render the received data in the component.</w:t>
+      </w:r>
+    </w:p>
+    <w:p>
+      <w:pPr>
+        <w:rPr>
+          <w:rFonts w:hint="default" w:ascii="Arial" w:hAnsi="Arial" w:cs="Arial"/>
+          <w:b/>
+          <w:bCs/>
+        </w:rPr>
+      </w:pPr>
+      <w:r>
+        <w:rPr>
+          <w:rFonts w:hint="default" w:ascii="Arial" w:hAnsi="Arial" w:cs="Arial"/>
+          <w:b/>
+          <w:bCs/>
+        </w:rPr>
+        <w:t>Fetch()</w:t>
+      </w:r>
+    </w:p>
+    <w:p>
+      <w:pPr>
+        <w:rPr>
+          <w:rFonts w:hint="default" w:ascii="Arial" w:hAnsi="Arial" w:cs="Arial"/>
+        </w:rPr>
+      </w:pPr>
+      <w:r>
+        <w:rPr>
+          <w:rFonts w:hint="default" w:ascii="Arial" w:hAnsi="Arial"/>
+        </w:rPr>
+        <w:t>⇒</w:t>
+      </w:r>
+      <w:r>
+        <w:rPr>
+          <w:rFonts w:hint="default" w:ascii="Arial" w:hAnsi="Arial" w:cs="Arial"/>
+        </w:rPr>
+        <w:t xml:space="preserve"> Sends HTTP requests: fetch() sends HTTP requests to a server, allowing you to interact with APIs.</w:t>
+      </w:r>
+    </w:p>
+    <w:p>
+      <w:pPr>
+        <w:rPr>
+          <w:rFonts w:hint="default" w:ascii="Arial" w:hAnsi="Arial" w:cs="Arial"/>
+        </w:rPr>
+      </w:pPr>
+      <w:r>
+        <w:rPr>
+          <w:rFonts w:hint="default" w:ascii="Arial" w:hAnsi="Arial"/>
+        </w:rPr>
+        <w:t>⇒</w:t>
+      </w:r>
+      <w:r>
+        <w:rPr>
+          <w:rFonts w:hint="default" w:ascii="Arial" w:hAnsi="Arial" w:cs="Arial"/>
+        </w:rPr>
+        <w:t xml:space="preserve"> Returns a Promise: fetch() returns a Promise that resolves to the response data.</w:t>
+      </w:r>
+    </w:p>
+    <w:p>
+      <w:pPr>
+        <w:rPr>
+          <w:rFonts w:hint="default" w:ascii="Arial" w:hAnsi="Arial" w:cs="Arial"/>
+        </w:rPr>
+      </w:pPr>
+      <w:r>
+        <w:rPr>
+          <w:rFonts w:hint="default" w:ascii="Arial" w:hAnsi="Arial"/>
+        </w:rPr>
+        <w:t>⇒</w:t>
+      </w:r>
+      <w:r>
+        <w:rPr>
+          <w:rFonts w:hint="default" w:ascii="Arial" w:hAnsi="Arial" w:cs="Arial"/>
+        </w:rPr>
+        <w:t xml:space="preserve"> Supports various HTTP methods: fetch() supports GET, POST, PUT, DELETE, and other HTTP methods.</w:t>
+      </w:r>
+    </w:p>
+    <w:p>
+      <w:pPr>
+        <w:rPr>
+          <w:rFonts w:hint="default" w:ascii="Arial" w:hAnsi="Arial" w:cs="Arial"/>
+        </w:rPr>
+      </w:pPr>
+      <w:r>
+        <w:rPr>
+          <w:rFonts w:hint="default" w:ascii="Arial" w:hAnsi="Arial"/>
+        </w:rPr>
+        <w:t>⇒</w:t>
+      </w:r>
+      <w:r>
+        <w:rPr>
+          <w:rFonts w:hint="default" w:ascii="Arial" w:hAnsi="Arial" w:cs="Arial"/>
+        </w:rPr>
+        <w:t xml:space="preserve"> Handles response data: fetch() provides methods to handle response data, such as json(), text(), and blob().</w:t>
+      </w:r>
+    </w:p>
+    <w:p>
+      <w:pPr>
+        <w:rPr>
+          <w:rFonts w:hint="default" w:ascii="Arial" w:hAnsi="Arial" w:cs="Arial"/>
+        </w:rPr>
+      </w:pPr>
+    </w:p>
+    <w:p>
+      <w:pPr>
+        <w:rPr>
+          <w:rFonts w:hint="default" w:ascii="Arial" w:hAnsi="Arial" w:cs="Arial"/>
+          <w:b/>
+          <w:bCs/>
+        </w:rPr>
+      </w:pPr>
+      <w:r>
+        <w:rPr>
+          <w:rFonts w:hint="default" w:ascii="Arial" w:hAnsi="Arial" w:cs="Arial"/>
+          <w:b/>
+          <w:bCs/>
+        </w:rPr>
+        <w:t>Axios()</w:t>
+      </w:r>
+    </w:p>
+    <w:p>
+      <w:pPr>
+        <w:rPr>
+          <w:rFonts w:hint="default" w:ascii="Arial" w:hAnsi="Arial" w:cs="Arial"/>
+        </w:rPr>
+      </w:pPr>
+      <w:r>
+        <w:rPr>
+          <w:rFonts w:hint="default" w:ascii="Arial" w:hAnsi="Arial"/>
+        </w:rPr>
+        <w:t>⇒</w:t>
+      </w:r>
+      <w:r>
+        <w:rPr>
+          <w:rFonts w:hint="default" w:ascii="Arial" w:hAnsi="Arial" w:cs="Arial"/>
+        </w:rPr>
+        <w:t xml:space="preserve"> Sends HTTP requests: axios() sends HTTP requests to a server, allowing you to interact with APIs.</w:t>
+      </w:r>
+    </w:p>
+    <w:p>
+      <w:pPr>
+        <w:rPr>
+          <w:rFonts w:hint="default" w:ascii="Arial" w:hAnsi="Arial" w:cs="Arial"/>
+        </w:rPr>
+      </w:pPr>
+      <w:r>
+        <w:rPr>
+          <w:rFonts w:hint="default" w:ascii="Arial" w:hAnsi="Arial"/>
+        </w:rPr>
+        <w:t>⇒</w:t>
+      </w:r>
+      <w:r>
+        <w:rPr>
+          <w:rFonts w:hint="default" w:ascii="Arial" w:hAnsi="Arial" w:cs="Arial"/>
+        </w:rPr>
+        <w:t xml:space="preserve"> Returns a Promise: axios() returns a Promise that resolves to the response data.</w:t>
+      </w:r>
+    </w:p>
+    <w:p>
+      <w:pPr>
+        <w:rPr>
+          <w:rFonts w:hint="default" w:ascii="Arial" w:hAnsi="Arial" w:cs="Arial"/>
+        </w:rPr>
+      </w:pPr>
+      <w:r>
+        <w:rPr>
+          <w:rFonts w:hint="default" w:ascii="Arial" w:hAnsi="Arial"/>
+        </w:rPr>
+        <w:t>⇒</w:t>
+      </w:r>
+      <w:r>
+        <w:rPr>
+          <w:rFonts w:hint="default" w:ascii="Arial" w:hAnsi="Arial" w:cs="Arial"/>
+        </w:rPr>
+        <w:t xml:space="preserve"> Supports various HTTP methods: axios() supports GET, POST, PUT, DELETE, and other HTTP methods.</w:t>
+      </w:r>
+    </w:p>
+    <w:p>
+      <w:pPr>
+        <w:rPr>
+          <w:rFonts w:hint="default" w:ascii="Arial" w:hAnsi="Arial" w:cs="Arial"/>
+        </w:rPr>
+      </w:pPr>
+      <w:r>
+        <w:rPr>
+          <w:rFonts w:hint="default" w:ascii="Arial" w:hAnsi="Arial"/>
+        </w:rPr>
+        <w:t>⇒</w:t>
+      </w:r>
+      <w:r>
+        <w:rPr>
+          <w:rFonts w:hint="default" w:ascii="Arial" w:hAnsi="Arial" w:cs="Arial"/>
+        </w:rPr>
+        <w:t xml:space="preserve"> Provides a simpler API: axios() provides a simpler API compared to fetch(), with a more intuitive syntax.</w:t>
+      </w:r>
+    </w:p>
+    <w:p>
+      <w:pPr>
+        <w:rPr>
+          <w:rFonts w:hint="default" w:ascii="Arial" w:hAnsi="Arial" w:cs="Arial"/>
+        </w:rPr>
+      </w:pPr>
+      <w:r>
+        <w:rPr>
+          <w:rFonts w:hint="default" w:ascii="Arial" w:hAnsi="Arial" w:cs="Arial"/>
+        </w:rPr>
+        <w:t>5. Handles response data: axios() automatically converts response data to JSON, making it easier to work with.</w:t>
+      </w:r>
+    </w:p>
+    <w:p>
+      <w:pPr>
+        <w:rPr>
+          <w:rFonts w:hint="default" w:ascii="Arial" w:hAnsi="Arial" w:cs="Arial"/>
+          <w:b/>
+          <w:bCs/>
+        </w:rPr>
+      </w:pPr>
+      <w:r>
+        <w:rPr>
+          <w:rFonts w:hint="default" w:ascii="Arial" w:hAnsi="Arial" w:cs="Arial"/>
+          <w:b/>
+          <w:bCs/>
+        </w:rPr>
+        <w:t>Q-4 What is Firebase? What features does Firebase offer?</w:t>
+      </w:r>
+    </w:p>
+    <w:p>
+      <w:pPr>
+        <w:rPr>
+          <w:rFonts w:hint="default" w:ascii="Arial" w:hAnsi="Arial" w:cs="Arial"/>
+        </w:rPr>
+      </w:pPr>
+      <w:r>
+        <w:rPr>
+          <w:rFonts w:hint="default" w:ascii="Arial" w:hAnsi="Arial" w:cs="Arial"/>
+          <w:b/>
+          <w:bCs/>
+        </w:rPr>
+        <w:t xml:space="preserve">Ans : </w:t>
+      </w:r>
+      <w:r>
+        <w:rPr>
+          <w:rFonts w:hint="default" w:ascii="Arial" w:hAnsi="Arial" w:cs="Arial"/>
+          <w:b/>
+          <w:bCs/>
+        </w:rPr>
+        <w:tab/>
+      </w:r>
+      <w:r>
+        <w:rPr>
+          <w:rFonts w:hint="default" w:ascii="Arial" w:hAnsi="Arial" w:cs="Arial"/>
+        </w:rPr>
+        <w:t>Firebase is a cloud-hosted platform that provides a suite of tools and services for building, managing, and scaling web and mobile applications. Firebase offers a range of features that enable developers to focus on building their applications without worrying about the underlying infrastructure.</w:t>
+      </w:r>
+    </w:p>
+    <w:p>
+      <w:pPr>
+        <w:rPr>
+          <w:rFonts w:hint="default" w:ascii="Arial" w:hAnsi="Arial" w:cs="Arial"/>
+          <w:b/>
+          <w:bCs/>
+        </w:rPr>
+      </w:pPr>
+      <w:r>
+        <w:rPr>
+          <w:rFonts w:hint="default" w:ascii="Arial" w:hAnsi="Arial" w:cs="Arial"/>
+          <w:b/>
+          <w:bCs/>
+        </w:rPr>
+        <w:t xml:space="preserve">Q-5 Discuss the importance of handling errors and loading states when working </w:t>
+      </w:r>
+    </w:p>
+    <w:p>
+      <w:pPr>
+        <w:rPr>
+          <w:rFonts w:hint="default" w:ascii="Arial" w:hAnsi="Arial" w:cs="Arial"/>
+          <w:b/>
+          <w:bCs/>
+        </w:rPr>
+      </w:pPr>
+      <w:r>
+        <w:rPr>
+          <w:rFonts w:hint="default" w:ascii="Arial" w:hAnsi="Arial" w:cs="Arial"/>
+          <w:b/>
+          <w:bCs/>
+        </w:rPr>
+        <w:t>withAPIs in React</w:t>
+      </w:r>
+    </w:p>
+    <w:p>
+      <w:pPr>
+        <w:rPr>
+          <w:rFonts w:hint="default" w:ascii="Arial" w:hAnsi="Arial" w:cs="Arial"/>
+        </w:rPr>
+      </w:pPr>
+      <w:r>
+        <w:rPr>
+          <w:rFonts w:hint="default" w:ascii="Arial" w:hAnsi="Arial" w:cs="Arial"/>
+          <w:b/>
+          <w:bCs/>
+        </w:rPr>
+        <w:t>Ans :</w:t>
+      </w:r>
+      <w:r>
+        <w:rPr>
+          <w:rFonts w:hint="default" w:ascii="Arial" w:hAnsi="Arial" w:cs="Arial"/>
+        </w:rPr>
+        <w:t xml:space="preserve"> </w:t>
+      </w:r>
+    </w:p>
+    <w:p>
+      <w:pPr>
+        <w:rPr>
+          <w:rFonts w:hint="default" w:ascii="Arial" w:hAnsi="Arial" w:cs="Arial"/>
+          <w:b/>
+          <w:bCs/>
+        </w:rPr>
+      </w:pPr>
+      <w:r>
+        <w:rPr>
+          <w:rFonts w:hint="default" w:ascii="Arial" w:hAnsi="Arial" w:cs="Arial"/>
+          <w:b/>
+          <w:bCs/>
+        </w:rPr>
+        <w:t>Importance of Error Handling</w:t>
+      </w:r>
+    </w:p>
+    <w:p>
+      <w:pPr>
+        <w:rPr>
+          <w:rFonts w:hint="default" w:ascii="Arial" w:hAnsi="Arial" w:cs="Arial"/>
+        </w:rPr>
+      </w:pPr>
+      <w:r>
+        <w:rPr>
+          <w:rFonts w:hint="default" w:ascii="Arial" w:hAnsi="Arial"/>
+        </w:rPr>
+        <w:t>⇒</w:t>
+      </w:r>
+      <w:r>
+        <w:rPr>
+          <w:rFonts w:hint="default" w:ascii="Arial" w:hAnsi="Arial"/>
+          <w:lang w:val="en-US"/>
+        </w:rPr>
+        <w:t xml:space="preserve"> </w:t>
+      </w:r>
+      <w:r>
+        <w:rPr>
+          <w:rFonts w:hint="default" w:ascii="Arial" w:hAnsi="Arial" w:cs="Arial"/>
+        </w:rPr>
         <w:t>Improves User Experience: Handles API errors, providing a better user experience.</w:t>
       </w:r>
     </w:p>
@@ -541,22 +609,41 @@
       </w:pPr>
       <w:r>
         <w:rPr>
-          <w:rFonts w:hint="default" w:ascii="Arial" w:hAnsi="Arial" w:cs="Arial"/>
-        </w:rPr>
-        <w:t>2. Prevents App Crashes: Catches and handles errors, preventing app crashes.</w:t>
-      </w:r>
-    </w:p>
-    <w:p>
-      <w:pPr>
-        <w:rPr>
-          <w:rFonts w:hint="default" w:ascii="Arial" w:hAnsi="Arial" w:cs="Arial"/>
-        </w:rPr>
-      </w:pPr>
-      <w:r>
-        <w:rPr>
-          <w:rFonts w:hint="default" w:ascii="Arial" w:hAnsi="Arial" w:cs="Arial"/>
-        </w:rPr>
-        <w:t>3. Provides Feedback: Displays error messages, informing users of issues.</w:t>
+          <w:rFonts w:hint="default" w:ascii="Arial" w:hAnsi="Arial"/>
+        </w:rPr>
+        <w:t>⇒</w:t>
+      </w:r>
+      <w:r>
+        <w:rPr>
+          <w:rFonts w:hint="default" w:ascii="Arial" w:hAnsi="Arial"/>
+          <w:lang w:val="en-US"/>
+        </w:rPr>
+        <w:t xml:space="preserve"> </w:t>
+      </w:r>
+      <w:r>
+        <w:rPr>
+          <w:rFonts w:hint="default" w:ascii="Arial" w:hAnsi="Arial" w:cs="Arial"/>
+        </w:rPr>
+        <w:t>Prevents App Crashes: Catches and handles errors, preventing app crashes.</w:t>
+      </w:r>
+    </w:p>
+    <w:p>
+      <w:pPr>
+        <w:rPr>
+          <w:rFonts w:hint="default" w:ascii="Arial" w:hAnsi="Arial" w:cs="Arial"/>
+        </w:rPr>
+      </w:pPr>
+      <w:r>
+        <w:rPr>
+          <w:rFonts w:hint="default" w:ascii="Arial" w:hAnsi="Arial"/>
+        </w:rPr>
+        <w:t>⇒</w:t>
+      </w:r>
+      <w:r>
+        <w:rPr>
+          <w:rFonts w:hint="default" w:ascii="Arial" w:hAnsi="Arial" w:cs="Arial"/>
+        </w:rPr>
+        <w:t xml:space="preserve"> Provides Feedback: Displays error messages, informing users of issues.</w:t>
       </w:r>
     </w:p>
     <w:p>
@@ -591,35 +678,53 @@
       </w:pPr>
       <w:r>
         <w:rPr>
-          <w:rFonts w:hint="default" w:ascii="Arial" w:hAnsi="Arial" w:cs="Arial"/>
-        </w:rPr>
-        <w:t>1. Enhances User Experience: Displays loading indicators, managing user expectations.</w:t>
-      </w:r>
-    </w:p>
-    <w:p>
-      <w:pPr>
-        <w:rPr>
-          <w:rFonts w:hint="default" w:ascii="Arial" w:hAnsi="Arial" w:cs="Arial"/>
-        </w:rPr>
-      </w:pPr>
-      <w:r>
-        <w:rPr>
-          <w:rFonts w:hint="default" w:ascii="Arial" w:hAnsi="Arial" w:cs="Arial"/>
-        </w:rPr>
-        <w:t>2. Prevents Multiple Requests: Handles loading states, preventing multiple API requests.</w:t>
-      </w:r>
-    </w:p>
-    <w:p>
-      <w:pPr>
-        <w:rPr>
-          <w:rFonts w:hint="default" w:ascii="Arial" w:hAnsi="Arial" w:cs="Arial"/>
-        </w:rPr>
-      </w:pPr>
-      <w:r>
-        <w:rPr>
-          <w:rFonts w:hint="default" w:ascii="Arial" w:hAnsi="Arial" w:cs="Arial"/>
-        </w:rPr>
-        <w:t>3. Improves App Performance: Optimizes app performance by handling loading states.</w:t>
+          <w:rFonts w:hint="default" w:ascii="Arial" w:hAnsi="Arial"/>
+        </w:rPr>
+        <w:t>⇒</w:t>
+      </w:r>
+      <w:r>
+        <w:rPr>
+          <w:rFonts w:hint="default" w:ascii="Arial" w:hAnsi="Arial" w:cs="Arial"/>
+        </w:rPr>
+        <w:t xml:space="preserve"> Enhances User Experience: Displays loading indicators, managing user expectations.</w:t>
+      </w:r>
+    </w:p>
+    <w:p>
+      <w:pPr>
+        <w:rPr>
+          <w:rFonts w:hint="default" w:ascii="Arial" w:hAnsi="Arial" w:cs="Arial"/>
+        </w:rPr>
+      </w:pPr>
+      <w:r>
+        <w:rPr>
+          <w:rFonts w:hint="default" w:ascii="Arial" w:hAnsi="Arial"/>
+        </w:rPr>
+        <w:t>⇒</w:t>
+      </w:r>
+      <w:r>
+        <w:rPr>
+          <w:rFonts w:hint="default" w:ascii="Arial" w:hAnsi="Arial" w:cs="Arial"/>
+        </w:rPr>
+        <w:t xml:space="preserve"> Prevents Multiple Requests: Handles loading states, preventing multiple API requests.</w:t>
+      </w:r>
+    </w:p>
+    <w:p>
+      <w:pPr>
+        <w:rPr>
+          <w:rFonts w:hint="default" w:ascii="Arial" w:hAnsi="Arial" w:cs="Arial"/>
+        </w:rPr>
+      </w:pPr>
+      <w:r>
+        <w:rPr>
+          <w:rFonts w:hint="default" w:ascii="Arial" w:hAnsi="Arial"/>
+        </w:rPr>
+        <w:t>⇒</w:t>
+      </w:r>
+      <w:r>
+        <w:rPr>
+          <w:rFonts w:hint="default" w:ascii="Arial" w:hAnsi="Arial" w:cs="Arial"/>
+        </w:rPr>
+        <w:t xml:space="preserve"> Improves App Performance: Optimizes app performance by handling loading states.</w:t>
       </w:r>
     </w:p>
     <w:sectPr>
@@ -758,7 +863,7 @@
     <w:lsdException w:qFormat="1" w:unhideWhenUsed="0" w:uiPriority="10" w:semiHidden="0" w:name="Title"/>
     <w:lsdException w:uiPriority="99" w:name="Closing"/>
     <w:lsdException w:uiPriority="99" w:name="Signature"/>
-    <w:lsdException w:uiPriority="1" w:semiHidden="0" w:name="Default Paragraph Font"/>
+    <w:lsdException w:qFormat="1" w:uiPriority="1" w:semiHidden="0" w:name="Default Paragraph Font"/>
     <w:lsdException w:uiPriority="99" w:name="Body Text"/>
     <w:lsdException w:uiPriority="99" w:name="Body Text Indent"/>
     <w:lsdException w:uiPriority="99" w:name="List Continue"/>
@@ -1184,6 +1289,7 @@
   <w:style w:type="character" w:default="1" w:styleId="11">
     <w:name w:val="Default Paragraph Font"/>
     <w:unhideWhenUsed/>
+    <w:qFormat/>
     <w:uiPriority w:val="1"/>
   </w:style>
   <w:style w:type="table" w:default="1" w:styleId="12">
@@ -1259,6 +1365,7 @@
     <w:basedOn w:val="11"/>
     <w:link w:val="3"/>
     <w:semiHidden/>
+    <w:qFormat/>
     <w:uiPriority w:val="9"/>
     <w:rPr>
       <w:rFonts w:asciiTheme="majorHAnsi" w:hAnsiTheme="majorHAnsi" w:eastAsiaTheme="majorEastAsia" w:cstheme="majorBidi"/>
@@ -1309,6 +1416,7 @@
     <w:basedOn w:val="11"/>
     <w:link w:val="7"/>
     <w:semiHidden/>
+    <w:qFormat/>
     <w:uiPriority w:val="9"/>
     <w:rPr>
       <w:rFonts w:eastAsiaTheme="majorEastAsia" w:cstheme="majorBidi"/>
@@ -1330,6 +1438,7 @@
     <w:basedOn w:val="11"/>
     <w:link w:val="8"/>
     <w:semiHidden/>
+    <w:qFormat/>
     <w:uiPriority w:val="9"/>
     <w:rPr>
       <w:rFonts w:eastAsiaTheme="majorEastAsia" w:cstheme="majorBidi"/>
@@ -1370,6 +1479,7 @@
     <w:basedOn w:val="11"/>
     <w:link w:val="10"/>
     <w:semiHidden/>
+    <w:qFormat/>
     <w:uiPriority w:val="9"/>
     <w:rPr>
       <w:rFonts w:eastAsiaTheme="majorEastAsia" w:cstheme="majorBidi"/>

</xml_diff>